<commit_message>
Reactivacion de octubre: dos plantillas mitad y mitad (A perder la oportunidad / B que no te de miedo hablar), piezas A y B, mensaje a Jaider y hoja del jueves con medicion por plantilla
Co-Authored-By: Claude Fable 5.1 <noreply@anthropic.com>
</commit_message>
<xml_diff>
--- a/recursos/comercial/plataforma LaHaus/HOJA_REUNION_JAIDER_2026-10-22.docx
+++ b/recursos/comercial/plataforma LaHaus/HOJA_REUNION_JAIDER_2026-10-22.docx
@@ -576,18 +576,38 @@
         <w:tblLook w:firstColumn="1" w:firstRow="1" w:lastColumn="0" w:lastRow="0" w:noHBand="0" w:noVBand="1" w:val="04A0"/>
       </w:tblPr>
       <w:tblGrid>
-        <w:gridCol w:w="1538"/>
-        <w:gridCol w:w="1538"/>
-        <w:gridCol w:w="1538"/>
-        <w:gridCol w:w="1538"/>
-        <w:gridCol w:w="1538"/>
-        <w:gridCol w:w="1538"/>
-        <w:gridCol w:w="1538"/>
+        <w:gridCol w:w="1346"/>
+        <w:gridCol w:w="1346"/>
+        <w:gridCol w:w="1346"/>
+        <w:gridCol w:w="1346"/>
+        <w:gridCol w:w="1346"/>
+        <w:gridCol w:w="1346"/>
+        <w:gridCol w:w="1346"/>
+        <w:gridCol w:w="1346"/>
       </w:tblGrid>
       <w:tr>
         <w:tc>
           <w:tcPr>
-            <w:tcW w:type="dxa" w:w="1304"/>
+            <w:tcW w:type="dxa" w:w="2041"/>
+            <w:shd w:val="clear" w:color="auto" w:fill="E54C09"/>
+          </w:tcPr>
+          <w:p>
+            <w:pPr>
+              <w:spacing w:after="0"/>
+            </w:pPr>
+            <w:r>
+              <w:rPr>
+                <w:b/>
+                <w:color w:val="FFFFFF"/>
+                <w:sz w:val="17"/>
+              </w:rPr>
+              <w:t>Plantilla</w:t>
+            </w:r>
+          </w:p>
+        </w:tc>
+        <w:tc>
+          <w:tcPr>
+            <w:tcW w:type="dxa" w:w="1020"/>
             <w:shd w:val="clear" w:color="auto" w:fill="E54C09"/>
           </w:tcPr>
           <w:p>
@@ -606,7 +626,7 @@
         </w:tc>
         <w:tc>
           <w:tcPr>
-            <w:tcW w:type="dxa" w:w="1304"/>
+            <w:tcW w:type="dxa" w:w="1077"/>
             <w:shd w:val="clear" w:color="auto" w:fill="E54C09"/>
           </w:tcPr>
           <w:p>
@@ -625,7 +645,7 @@
         </w:tc>
         <w:tc>
           <w:tcPr>
-            <w:tcW w:type="dxa" w:w="1701"/>
+            <w:tcW w:type="dxa" w:w="1531"/>
             <w:shd w:val="clear" w:color="auto" w:fill="E54C09"/>
           </w:tcPr>
           <w:p>
@@ -644,7 +664,7 @@
         </w:tc>
         <w:tc>
           <w:tcPr>
-            <w:tcW w:type="dxa" w:w="1587"/>
+            <w:tcW w:type="dxa" w:w="1361"/>
             <w:shd w:val="clear" w:color="auto" w:fill="E54C09"/>
           </w:tcPr>
           <w:p>
@@ -663,7 +683,7 @@
         </w:tc>
         <w:tc>
           <w:tcPr>
-            <w:tcW w:type="dxa" w:w="1247"/>
+            <w:tcW w:type="dxa" w:w="1134"/>
             <w:shd w:val="clear" w:color="auto" w:fill="E54C09"/>
           </w:tcPr>
           <w:p>
@@ -682,7 +702,7 @@
         </w:tc>
         <w:tc>
           <w:tcPr>
-            <w:tcW w:type="dxa" w:w="1701"/>
+            <w:tcW w:type="dxa" w:w="964"/>
             <w:shd w:val="clear" w:color="auto" w:fill="E54C09"/>
           </w:tcPr>
           <w:p>
@@ -695,13 +715,13 @@
                 <w:color w:val="FFFFFF"/>
                 <w:sz w:val="17"/>
               </w:rPr>
-              <w:t>Respondieron por texto</w:t>
+              <w:t>Por texto</w:t>
             </w:r>
           </w:p>
         </w:tc>
         <w:tc>
           <w:tcPr>
-            <w:tcW w:type="dxa" w:w="1134"/>
+            <w:tcW w:type="dxa" w:w="964"/>
             <w:shd w:val="clear" w:color="auto" w:fill="E54C09"/>
           </w:tcPr>
           <w:p>
@@ -722,7 +742,7 @@
       <w:tr>
         <w:tc>
           <w:tcPr>
-            <w:tcW w:type="dxa" w:w="1304"/>
+            <w:tcW w:type="dxa" w:w="2041"/>
           </w:tcPr>
           <w:p>
             <w:pPr>
@@ -733,12 +753,13 @@
                 <w:b/>
                 <w:sz w:val="17"/>
               </w:rPr>
+              <w:t>A · perder la oportunidad</w:t>
             </w:r>
           </w:p>
         </w:tc>
         <w:tc>
           <w:tcPr>
-            <w:tcW w:type="dxa" w:w="1304"/>
+            <w:tcW w:type="dxa" w:w="1020"/>
           </w:tcPr>
           <w:p>
             <w:pPr>
@@ -754,7 +775,7 @@
         </w:tc>
         <w:tc>
           <w:tcPr>
-            <w:tcW w:type="dxa" w:w="1701"/>
+            <w:tcW w:type="dxa" w:w="1077"/>
           </w:tcPr>
           <w:p>
             <w:pPr>
@@ -770,7 +791,7 @@
         </w:tc>
         <w:tc>
           <w:tcPr>
-            <w:tcW w:type="dxa" w:w="1587"/>
+            <w:tcW w:type="dxa" w:w="1531"/>
           </w:tcPr>
           <w:p>
             <w:pPr>
@@ -786,23 +807,7 @@
         </w:tc>
         <w:tc>
           <w:tcPr>
-            <w:tcW w:type="dxa" w:w="1247"/>
-          </w:tcPr>
-          <w:p>
-            <w:pPr>
-              <w:spacing w:after="0"/>
-            </w:pPr>
-            <w:r>
-              <w:rPr>
-                <w:b w:val="0"/>
-                <w:sz w:val="17"/>
-              </w:rPr>
-            </w:r>
-          </w:p>
-        </w:tc>
-        <w:tc>
-          <w:tcPr>
-            <w:tcW w:type="dxa" w:w="1701"/>
+            <w:tcW w:type="dxa" w:w="1361"/>
           </w:tcPr>
           <w:p>
             <w:pPr>
@@ -819,6 +824,169 @@
         <w:tc>
           <w:tcPr>
             <w:tcW w:type="dxa" w:w="1134"/>
+          </w:tcPr>
+          <w:p>
+            <w:pPr>
+              <w:spacing w:after="0"/>
+            </w:pPr>
+            <w:r>
+              <w:rPr>
+                <w:b w:val="0"/>
+                <w:sz w:val="17"/>
+              </w:rPr>
+            </w:r>
+          </w:p>
+        </w:tc>
+        <w:tc>
+          <w:tcPr>
+            <w:tcW w:type="dxa" w:w="964"/>
+          </w:tcPr>
+          <w:p>
+            <w:pPr>
+              <w:spacing w:after="0"/>
+            </w:pPr>
+            <w:r>
+              <w:rPr>
+                <w:b w:val="0"/>
+                <w:sz w:val="17"/>
+              </w:rPr>
+            </w:r>
+          </w:p>
+        </w:tc>
+        <w:tc>
+          <w:tcPr>
+            <w:tcW w:type="dxa" w:w="964"/>
+          </w:tcPr>
+          <w:p>
+            <w:pPr>
+              <w:spacing w:after="0"/>
+            </w:pPr>
+            <w:r>
+              <w:rPr>
+                <w:b w:val="0"/>
+                <w:sz w:val="17"/>
+              </w:rPr>
+            </w:r>
+          </w:p>
+        </w:tc>
+      </w:tr>
+      <w:tr>
+        <w:tc>
+          <w:tcPr>
+            <w:tcW w:type="dxa" w:w="2041"/>
+          </w:tcPr>
+          <w:p>
+            <w:pPr>
+              <w:spacing w:after="0"/>
+            </w:pPr>
+            <w:r>
+              <w:rPr>
+                <w:b/>
+                <w:sz w:val="17"/>
+              </w:rPr>
+              <w:t>B · que no te dé miedo hablar</w:t>
+            </w:r>
+          </w:p>
+        </w:tc>
+        <w:tc>
+          <w:tcPr>
+            <w:tcW w:type="dxa" w:w="1020"/>
+          </w:tcPr>
+          <w:p>
+            <w:pPr>
+              <w:spacing w:after="0"/>
+            </w:pPr>
+            <w:r>
+              <w:rPr>
+                <w:b w:val="0"/>
+                <w:sz w:val="17"/>
+              </w:rPr>
+            </w:r>
+          </w:p>
+        </w:tc>
+        <w:tc>
+          <w:tcPr>
+            <w:tcW w:type="dxa" w:w="1077"/>
+          </w:tcPr>
+          <w:p>
+            <w:pPr>
+              <w:spacing w:after="0"/>
+            </w:pPr>
+            <w:r>
+              <w:rPr>
+                <w:b w:val="0"/>
+                <w:sz w:val="17"/>
+              </w:rPr>
+            </w:r>
+          </w:p>
+        </w:tc>
+        <w:tc>
+          <w:tcPr>
+            <w:tcW w:type="dxa" w:w="1531"/>
+          </w:tcPr>
+          <w:p>
+            <w:pPr>
+              <w:spacing w:after="0"/>
+            </w:pPr>
+            <w:r>
+              <w:rPr>
+                <w:b w:val="0"/>
+                <w:sz w:val="17"/>
+              </w:rPr>
+            </w:r>
+          </w:p>
+        </w:tc>
+        <w:tc>
+          <w:tcPr>
+            <w:tcW w:type="dxa" w:w="1361"/>
+          </w:tcPr>
+          <w:p>
+            <w:pPr>
+              <w:spacing w:after="0"/>
+            </w:pPr>
+            <w:r>
+              <w:rPr>
+                <w:b w:val="0"/>
+                <w:sz w:val="17"/>
+              </w:rPr>
+            </w:r>
+          </w:p>
+        </w:tc>
+        <w:tc>
+          <w:tcPr>
+            <w:tcW w:type="dxa" w:w="1134"/>
+          </w:tcPr>
+          <w:p>
+            <w:pPr>
+              <w:spacing w:after="0"/>
+            </w:pPr>
+            <w:r>
+              <w:rPr>
+                <w:b w:val="0"/>
+                <w:sz w:val="17"/>
+              </w:rPr>
+            </w:r>
+          </w:p>
+        </w:tc>
+        <w:tc>
+          <w:tcPr>
+            <w:tcW w:type="dxa" w:w="964"/>
+          </w:tcPr>
+          <w:p>
+            <w:pPr>
+              <w:spacing w:after="0"/>
+            </w:pPr>
+            <w:r>
+              <w:rPr>
+                <w:b w:val="0"/>
+                <w:sz w:val="17"/>
+              </w:rPr>
+            </w:r>
+          </w:p>
+        </w:tc>
+        <w:tc>
+          <w:tcPr>
+            <w:tcW w:type="dxa" w:w="964"/>
           </w:tcPr>
           <w:p>
             <w:pPr>
@@ -849,7 +1017,7 @@
           <w:color w:val="666666"/>
           <w:sz w:val="17"/>
         </w:rPr>
-        <w:t>Reserva del bot anterior (unos 1.500) sale la primera semana de noviembre con la misma plantilla. "Más adelante" entra a la reactivación de la semana del 23 de noviembre.</w:t>
+        <w:t>Dos plantillas mitad y mitad; la que dé más citas por enviado se queda para la reserva del bot anterior (unos 1.500), que sale la primera semana de noviembre. "Más adelante" entra a la reactivación de la semana del 23 de noviembre.</w:t>
       </w:r>
     </w:p>
     <w:p>

</xml_diff>

<commit_message>
Reactivacion de octubre: pregunta de motivo (viajar, trabajar o estudiar) como cierre y botones; el clic es la respuesta al paso 1 del agente
Co-Authored-By: Claude Fable 5.1 <noreply@anthropic.com>
</commit_message>
<xml_diff>
--- a/recursos/comercial/plataforma LaHaus/HOJA_REUNION_JAIDER_2026-10-22.docx
+++ b/recursos/comercial/plataforma LaHaus/HOJA_REUNION_JAIDER_2026-10-22.docx
@@ -576,14 +576,15 @@
         <w:tblLook w:firstColumn="1" w:firstRow="1" w:lastColumn="0" w:lastRow="0" w:noHBand="0" w:noVBand="1" w:val="04A0"/>
       </w:tblPr>
       <w:tblGrid>
-        <w:gridCol w:w="1346"/>
-        <w:gridCol w:w="1346"/>
-        <w:gridCol w:w="1346"/>
-        <w:gridCol w:w="1346"/>
-        <w:gridCol w:w="1346"/>
-        <w:gridCol w:w="1346"/>
-        <w:gridCol w:w="1346"/>
-        <w:gridCol w:w="1346"/>
+        <w:gridCol w:w="1196"/>
+        <w:gridCol w:w="1196"/>
+        <w:gridCol w:w="1196"/>
+        <w:gridCol w:w="1196"/>
+        <w:gridCol w:w="1196"/>
+        <w:gridCol w:w="1196"/>
+        <w:gridCol w:w="1196"/>
+        <w:gridCol w:w="1196"/>
+        <w:gridCol w:w="1196"/>
       </w:tblGrid>
       <w:tr>
         <w:tc>
@@ -645,7 +646,7 @@
         </w:tc>
         <w:tc>
           <w:tcPr>
-            <w:tcW w:type="dxa" w:w="1531"/>
+            <w:tcW w:type="dxa" w:w="907"/>
             <w:shd w:val="clear" w:color="auto" w:fill="E54C09"/>
           </w:tcPr>
           <w:p>
@@ -658,13 +659,13 @@
                 <w:color w:val="FFFFFF"/>
                 <w:sz w:val="17"/>
               </w:rPr>
-              <w:t>Botón "quiero mi fecha"</w:t>
+              <w:t>Viajar</w:t>
             </w:r>
           </w:p>
         </w:tc>
         <w:tc>
           <w:tcPr>
-            <w:tcW w:type="dxa" w:w="1361"/>
+            <w:tcW w:type="dxa" w:w="1020"/>
             <w:shd w:val="clear" w:color="auto" w:fill="E54C09"/>
           </w:tcPr>
           <w:p>
@@ -677,7 +678,45 @@
                 <w:color w:val="FFFFFF"/>
                 <w:sz w:val="17"/>
               </w:rPr>
-              <w:t>Botón "más adelante"</w:t>
+              <w:t>Trabajar</w:t>
+            </w:r>
+          </w:p>
+        </w:tc>
+        <w:tc>
+          <w:tcPr>
+            <w:tcW w:type="dxa" w:w="1020"/>
+            <w:shd w:val="clear" w:color="auto" w:fill="E54C09"/>
+          </w:tcPr>
+          <w:p>
+            <w:pPr>
+              <w:spacing w:after="0"/>
+            </w:pPr>
+            <w:r>
+              <w:rPr>
+                <w:b/>
+                <w:color w:val="FFFFFF"/>
+                <w:sz w:val="17"/>
+              </w:rPr>
+              <w:t>Estudiar</w:t>
+            </w:r>
+          </w:p>
+        </w:tc>
+        <w:tc>
+          <w:tcPr>
+            <w:tcW w:type="dxa" w:w="1020"/>
+            <w:shd w:val="clear" w:color="auto" w:fill="E54C09"/>
+          </w:tcPr>
+          <w:p>
+            <w:pPr>
+              <w:spacing w:after="0"/>
+            </w:pPr>
+            <w:r>
+              <w:rPr>
+                <w:b/>
+                <w:color w:val="FFFFFF"/>
+                <w:sz w:val="17"/>
+              </w:rPr>
+              <w:t>Por texto</w:t>
             </w:r>
           </w:p>
         </w:tc>
@@ -702,26 +741,7 @@
         </w:tc>
         <w:tc>
           <w:tcPr>
-            <w:tcW w:type="dxa" w:w="964"/>
-            <w:shd w:val="clear" w:color="auto" w:fill="E54C09"/>
-          </w:tcPr>
-          <w:p>
-            <w:pPr>
-              <w:spacing w:after="0"/>
-            </w:pPr>
-            <w:r>
-              <w:rPr>
-                <w:b/>
-                <w:color w:val="FFFFFF"/>
-                <w:sz w:val="17"/>
-              </w:rPr>
-              <w:t>Por texto</w:t>
-            </w:r>
-          </w:p>
-        </w:tc>
-        <w:tc>
-          <w:tcPr>
-            <w:tcW w:type="dxa" w:w="964"/>
+            <w:tcW w:type="dxa" w:w="850"/>
             <w:shd w:val="clear" w:color="auto" w:fill="E54C09"/>
           </w:tcPr>
           <w:p>
@@ -791,7 +811,7 @@
         </w:tc>
         <w:tc>
           <w:tcPr>
-            <w:tcW w:type="dxa" w:w="1531"/>
+            <w:tcW w:type="dxa" w:w="907"/>
           </w:tcPr>
           <w:p>
             <w:pPr>
@@ -807,7 +827,39 @@
         </w:tc>
         <w:tc>
           <w:tcPr>
-            <w:tcW w:type="dxa" w:w="1361"/>
+            <w:tcW w:type="dxa" w:w="1020"/>
+          </w:tcPr>
+          <w:p>
+            <w:pPr>
+              <w:spacing w:after="0"/>
+            </w:pPr>
+            <w:r>
+              <w:rPr>
+                <w:b w:val="0"/>
+                <w:sz w:val="17"/>
+              </w:rPr>
+            </w:r>
+          </w:p>
+        </w:tc>
+        <w:tc>
+          <w:tcPr>
+            <w:tcW w:type="dxa" w:w="1020"/>
+          </w:tcPr>
+          <w:p>
+            <w:pPr>
+              <w:spacing w:after="0"/>
+            </w:pPr>
+            <w:r>
+              <w:rPr>
+                <w:b w:val="0"/>
+                <w:sz w:val="17"/>
+              </w:rPr>
+            </w:r>
+          </w:p>
+        </w:tc>
+        <w:tc>
+          <w:tcPr>
+            <w:tcW w:type="dxa" w:w="1020"/>
           </w:tcPr>
           <w:p>
             <w:pPr>
@@ -839,23 +891,7 @@
         </w:tc>
         <w:tc>
           <w:tcPr>
-            <w:tcW w:type="dxa" w:w="964"/>
-          </w:tcPr>
-          <w:p>
-            <w:pPr>
-              <w:spacing w:after="0"/>
-            </w:pPr>
-            <w:r>
-              <w:rPr>
-                <w:b w:val="0"/>
-                <w:sz w:val="17"/>
-              </w:rPr>
-            </w:r>
-          </w:p>
-        </w:tc>
-        <w:tc>
-          <w:tcPr>
-            <w:tcW w:type="dxa" w:w="964"/>
+            <w:tcW w:type="dxa" w:w="850"/>
           </w:tcPr>
           <w:p>
             <w:pPr>
@@ -922,7 +958,7 @@
         </w:tc>
         <w:tc>
           <w:tcPr>
-            <w:tcW w:type="dxa" w:w="1531"/>
+            <w:tcW w:type="dxa" w:w="907"/>
           </w:tcPr>
           <w:p>
             <w:pPr>
@@ -938,7 +974,39 @@
         </w:tc>
         <w:tc>
           <w:tcPr>
-            <w:tcW w:type="dxa" w:w="1361"/>
+            <w:tcW w:type="dxa" w:w="1020"/>
+          </w:tcPr>
+          <w:p>
+            <w:pPr>
+              <w:spacing w:after="0"/>
+            </w:pPr>
+            <w:r>
+              <w:rPr>
+                <w:b w:val="0"/>
+                <w:sz w:val="17"/>
+              </w:rPr>
+            </w:r>
+          </w:p>
+        </w:tc>
+        <w:tc>
+          <w:tcPr>
+            <w:tcW w:type="dxa" w:w="1020"/>
+          </w:tcPr>
+          <w:p>
+            <w:pPr>
+              <w:spacing w:after="0"/>
+            </w:pPr>
+            <w:r>
+              <w:rPr>
+                <w:b w:val="0"/>
+                <w:sz w:val="17"/>
+              </w:rPr>
+            </w:r>
+          </w:p>
+        </w:tc>
+        <w:tc>
+          <w:tcPr>
+            <w:tcW w:type="dxa" w:w="1020"/>
           </w:tcPr>
           <w:p>
             <w:pPr>
@@ -970,23 +1038,7 @@
         </w:tc>
         <w:tc>
           <w:tcPr>
-            <w:tcW w:type="dxa" w:w="964"/>
-          </w:tcPr>
-          <w:p>
-            <w:pPr>
-              <w:spacing w:after="0"/>
-            </w:pPr>
-            <w:r>
-              <w:rPr>
-                <w:b w:val="0"/>
-                <w:sz w:val="17"/>
-              </w:rPr>
-            </w:r>
-          </w:p>
-        </w:tc>
-        <w:tc>
-          <w:tcPr>
-            <w:tcW w:type="dxa" w:w="964"/>
+            <w:tcW w:type="dxa" w:w="850"/>
           </w:tcPr>
           <w:p>
             <w:pPr>

</xml_diff>